<commit_message>
benjamin casellas documento terminado
</commit_message>
<xml_diff>
--- a/Experiencia_1 - Planificación de proyecto/Actividad-1 - Autoevaluaciones_Grupo2/1.1_APT122_AutoevaluacionCompetenciasFase1 benjamin casellas.docx
+++ b/Experiencia_1 - Planificación de proyecto/Actividad-1 - Autoevaluaciones_Grupo2/1.1_APT122_AutoevaluacionCompetenciasFase1 benjamin casellas.docx
@@ -842,7 +842,34 @@
                 <w:sz w:val="24"/>
                 <w:szCs w:val="24"/>
               </w:rPr>
-              <w:t xml:space="preserve">Benjamín Casellas </w:t>
+              <w:t>Benjamín</w:t>
+            </w:r>
+            <w:r>
+              <w:rPr>
+                <w:rFonts w:eastAsiaTheme="majorEastAsia"/>
+                <w:color w:val="767171" w:themeColor="background2" w:themeShade="80"/>
+                <w:sz w:val="24"/>
+                <w:szCs w:val="24"/>
+              </w:rPr>
+              <w:t xml:space="preserve"> Isaac</w:t>
+            </w:r>
+            <w:r>
+              <w:rPr>
+                <w:rFonts w:eastAsiaTheme="majorEastAsia"/>
+                <w:color w:val="767171" w:themeColor="background2" w:themeShade="80"/>
+                <w:sz w:val="24"/>
+                <w:szCs w:val="24"/>
+              </w:rPr>
+              <w:t xml:space="preserve"> Casellas </w:t>
+            </w:r>
+            <w:r>
+              <w:rPr>
+                <w:rFonts w:eastAsiaTheme="majorEastAsia"/>
+                <w:color w:val="767171" w:themeColor="background2" w:themeShade="80"/>
+                <w:sz w:val="24"/>
+                <w:szCs w:val="24"/>
+              </w:rPr>
+              <w:t xml:space="preserve">Madrid </w:t>
             </w:r>
           </w:p>
         </w:tc>
@@ -896,6 +923,15 @@
                 <w:szCs w:val="24"/>
               </w:rPr>
             </w:pPr>
+            <w:r>
+              <w:rPr>
+                <w:rFonts w:eastAsiaTheme="majorEastAsia"/>
+                <w:color w:val="767171" w:themeColor="background2" w:themeShade="80"/>
+                <w:sz w:val="24"/>
+                <w:szCs w:val="24"/>
+              </w:rPr>
+              <w:t xml:space="preserve">Tradicional </w:t>
+            </w:r>
           </w:p>
         </w:tc>
       </w:tr>
@@ -951,6 +987,15 @@
                 <w:szCs w:val="24"/>
               </w:rPr>
             </w:pPr>
+            <w:r>
+              <w:rPr>
+                <w:rFonts w:eastAsiaTheme="majorEastAsia"/>
+                <w:color w:val="767171" w:themeColor="background2" w:themeShade="80"/>
+                <w:sz w:val="24"/>
+                <w:szCs w:val="24"/>
+              </w:rPr>
+              <w:t>Año 2023</w:t>
+            </w:r>
           </w:p>
         </w:tc>
       </w:tr>
@@ -1003,13 +1048,13 @@
         <w:tblLook w:val="04A0" w:firstRow="1" w:lastRow="0" w:firstColumn="1" w:lastColumn="0" w:noHBand="0" w:noVBand="1"/>
       </w:tblPr>
       <w:tblGrid>
-        <w:gridCol w:w="1931"/>
-        <w:gridCol w:w="1017"/>
-        <w:gridCol w:w="926"/>
-        <w:gridCol w:w="1055"/>
-        <w:gridCol w:w="1187"/>
-        <w:gridCol w:w="1250"/>
-        <w:gridCol w:w="2557"/>
+        <w:gridCol w:w="2447"/>
+        <w:gridCol w:w="937"/>
+        <w:gridCol w:w="909"/>
+        <w:gridCol w:w="1035"/>
+        <w:gridCol w:w="1164"/>
+        <w:gridCol w:w="1157"/>
+        <w:gridCol w:w="2274"/>
       </w:tblGrid>
       <w:tr>
         <w:trPr>
@@ -1018,7 +1063,7 @@
         </w:trPr>
         <w:tc>
           <w:tcPr>
-            <w:tcW w:w="1931" w:type="dxa"/>
+            <w:tcW w:w="2689" w:type="dxa"/>
             <w:vMerge w:val="restart"/>
             <w:vAlign w:val="center"/>
           </w:tcPr>
@@ -1045,7 +1090,7 @@
         </w:tc>
         <w:tc>
           <w:tcPr>
-            <w:tcW w:w="5435" w:type="dxa"/>
+            <w:tcW w:w="4677" w:type="dxa"/>
             <w:gridSpan w:val="5"/>
             <w:vAlign w:val="center"/>
           </w:tcPr>
@@ -1105,7 +1150,7 @@
         </w:trPr>
         <w:tc>
           <w:tcPr>
-            <w:tcW w:w="1931" w:type="dxa"/>
+            <w:tcW w:w="2689" w:type="dxa"/>
             <w:vMerge/>
           </w:tcPr>
           <w:p>
@@ -1122,7 +1167,7 @@
         </w:tc>
         <w:tc>
           <w:tcPr>
-            <w:tcW w:w="1017" w:type="dxa"/>
+            <w:tcW w:w="259" w:type="dxa"/>
             <w:vAlign w:val="center"/>
           </w:tcPr>
           <w:p>
@@ -1274,7 +1319,8 @@
         </w:trPr>
         <w:tc>
           <w:tcPr>
-            <w:tcW w:w="1931" w:type="dxa"/>
+            <w:tcW w:w="2689" w:type="dxa"/>
+            <w:vAlign w:val="center"/>
           </w:tcPr>
           <w:p>
             <w:pPr>
@@ -1287,11 +1333,17 @@
                 <w:szCs w:val="18"/>
               </w:rPr>
             </w:pPr>
+            <w:r>
+              <w:rPr>
+                <w:sz w:val="20"/>
+              </w:rPr>
+              <w:t>Analizar y planificar requerimientos informáticos, diseñando y gestionando requisitos y prototipos según las necesidades del cliente.</w:t>
+            </w:r>
           </w:p>
         </w:tc>
         <w:tc>
           <w:tcPr>
-            <w:tcW w:w="1017" w:type="dxa"/>
+            <w:tcW w:w="259" w:type="dxa"/>
           </w:tcPr>
           <w:p>
             <w:pPr>
@@ -1335,6 +1387,15 @@
                 <w:szCs w:val="18"/>
               </w:rPr>
             </w:pPr>
+            <w:r>
+              <w:rPr>
+                <w:b/>
+                <w:bCs/>
+                <w:sz w:val="18"/>
+                <w:szCs w:val="18"/>
+              </w:rPr>
+              <w:t>X</w:t>
+            </w:r>
           </w:p>
         </w:tc>
         <w:tc>
@@ -1372,10 +1433,10 @@
         <w:tc>
           <w:tcPr>
             <w:tcW w:w="2557" w:type="dxa"/>
+            <w:vAlign w:val="center"/>
           </w:tcPr>
           <w:p>
             <w:pPr>
-              <w:jc w:val="center"/>
               <w:rPr>
                 <w:b/>
                 <w:bCs/>
@@ -1383,6 +1444,12 @@
                 <w:szCs w:val="18"/>
               </w:rPr>
             </w:pPr>
+            <w:r>
+              <w:rPr>
+                <w:sz w:val="18"/>
+              </w:rPr>
+              <w:t>Logré levantar requisitos y diseñar prototipos funcionales; debo seguir profundizando en la gestión de expectativas del cliente.</w:t>
+            </w:r>
           </w:p>
         </w:tc>
       </w:tr>
@@ -1393,7 +1460,8 @@
         </w:trPr>
         <w:tc>
           <w:tcPr>
-            <w:tcW w:w="1931" w:type="dxa"/>
+            <w:tcW w:w="2689" w:type="dxa"/>
+            <w:vAlign w:val="center"/>
           </w:tcPr>
           <w:p>
             <w:pPr>
@@ -1406,11 +1474,17 @@
                 <w:szCs w:val="18"/>
               </w:rPr>
             </w:pPr>
+            <w:r>
+              <w:rPr>
+                <w:sz w:val="20"/>
+              </w:rPr>
+              <w:t>Desarrollar software aplicando programación de algoritmos y desarrollo de aplicaciones de escritorio, web y móviles.</w:t>
+            </w:r>
           </w:p>
         </w:tc>
         <w:tc>
           <w:tcPr>
-            <w:tcW w:w="1017" w:type="dxa"/>
+            <w:tcW w:w="259" w:type="dxa"/>
           </w:tcPr>
           <w:p>
             <w:pPr>
@@ -1454,6 +1528,15 @@
                 <w:szCs w:val="18"/>
               </w:rPr>
             </w:pPr>
+            <w:r>
+              <w:rPr>
+                <w:b/>
+                <w:bCs/>
+                <w:sz w:val="18"/>
+                <w:szCs w:val="18"/>
+              </w:rPr>
+              <w:t>X</w:t>
+            </w:r>
           </w:p>
         </w:tc>
         <w:tc>
@@ -1491,10 +1574,10 @@
         <w:tc>
           <w:tcPr>
             <w:tcW w:w="2557" w:type="dxa"/>
+            <w:vAlign w:val="center"/>
           </w:tcPr>
           <w:p>
             <w:pPr>
-              <w:jc w:val="center"/>
               <w:rPr>
                 <w:b/>
                 <w:bCs/>
@@ -1502,6 +1585,12 @@
                 <w:szCs w:val="18"/>
               </w:rPr>
             </w:pPr>
+            <w:r>
+              <w:rPr>
+                <w:sz w:val="18"/>
+              </w:rPr>
+              <w:t>Desarrollé aplicaciones en distintas plataformas cumpliendo los aprendizajes esperados; me falta práctica en optimización de código.</w:t>
+            </w:r>
           </w:p>
         </w:tc>
       </w:tr>
@@ -1512,7 +1601,8 @@
         </w:trPr>
         <w:tc>
           <w:tcPr>
-            <w:tcW w:w="1931" w:type="dxa"/>
+            <w:tcW w:w="2689" w:type="dxa"/>
+            <w:vAlign w:val="center"/>
           </w:tcPr>
           <w:p>
             <w:pPr>
@@ -1524,11 +1614,17 @@
                 <w:szCs w:val="18"/>
               </w:rPr>
             </w:pPr>
+            <w:r>
+              <w:rPr>
+                <w:sz w:val="20"/>
+              </w:rPr>
+              <w:t>Analizar y desarrollar modelos de datos mediante el modelamiento, consulta y programación de bases de datos.</w:t>
+            </w:r>
           </w:p>
         </w:tc>
         <w:tc>
           <w:tcPr>
-            <w:tcW w:w="1017" w:type="dxa"/>
+            <w:tcW w:w="259" w:type="dxa"/>
           </w:tcPr>
           <w:p>
             <w:pPr>
@@ -1572,6 +1668,15 @@
                 <w:szCs w:val="18"/>
               </w:rPr>
             </w:pPr>
+            <w:r>
+              <w:rPr>
+                <w:b/>
+                <w:bCs/>
+                <w:sz w:val="18"/>
+                <w:szCs w:val="18"/>
+              </w:rPr>
+              <w:t>X</w:t>
+            </w:r>
           </w:p>
         </w:tc>
         <w:tc>
@@ -1609,10 +1714,10 @@
         <w:tc>
           <w:tcPr>
             <w:tcW w:w="2557" w:type="dxa"/>
+            <w:vAlign w:val="center"/>
           </w:tcPr>
           <w:p>
             <w:pPr>
-              <w:jc w:val="center"/>
               <w:rPr>
                 <w:b/>
                 <w:bCs/>
@@ -1620,6 +1725,12 @@
                 <w:szCs w:val="18"/>
               </w:rPr>
             </w:pPr>
+            <w:r>
+              <w:rPr>
+                <w:sz w:val="18"/>
+              </w:rPr>
+              <w:t>Modelé y programé bases de datos relacionales de forma adecuada; requiero reforzar consultas complejas y normalización avanzada.</w:t>
+            </w:r>
           </w:p>
         </w:tc>
       </w:tr>
@@ -1630,7 +1741,8 @@
         </w:trPr>
         <w:tc>
           <w:tcPr>
-            <w:tcW w:w="1931" w:type="dxa"/>
+            <w:tcW w:w="2689" w:type="dxa"/>
+            <w:vAlign w:val="center"/>
           </w:tcPr>
           <w:p>
             <w:pPr>
@@ -1642,11 +1754,17 @@
                 <w:szCs w:val="18"/>
               </w:rPr>
             </w:pPr>
+            <w:r>
+              <w:rPr>
+                <w:sz w:val="20"/>
+              </w:rPr>
+              <w:t>Asegurar la calidad de software aplicando estándares, técnicas y herramientas de calidad en el ciclo de desarrollo.</w:t>
+            </w:r>
           </w:p>
         </w:tc>
         <w:tc>
           <w:tcPr>
-            <w:tcW w:w="1017" w:type="dxa"/>
+            <w:tcW w:w="259" w:type="dxa"/>
           </w:tcPr>
           <w:p>
             <w:pPr>
@@ -1690,6 +1808,15 @@
                 <w:szCs w:val="18"/>
               </w:rPr>
             </w:pPr>
+            <w:r>
+              <w:rPr>
+                <w:b/>
+                <w:bCs/>
+                <w:sz w:val="18"/>
+                <w:szCs w:val="18"/>
+              </w:rPr>
+              <w:t>X</w:t>
+            </w:r>
           </w:p>
         </w:tc>
         <w:tc>
@@ -1727,10 +1854,10 @@
         <w:tc>
           <w:tcPr>
             <w:tcW w:w="2557" w:type="dxa"/>
+            <w:vAlign w:val="center"/>
           </w:tcPr>
           <w:p>
             <w:pPr>
-              <w:jc w:val="center"/>
               <w:rPr>
                 <w:b/>
                 <w:bCs/>
@@ -1738,6 +1865,26 @@
                 <w:szCs w:val="18"/>
               </w:rPr>
             </w:pPr>
+            <w:r>
+              <w:rPr>
+                <w:sz w:val="18"/>
+              </w:rPr>
+              <w:t xml:space="preserve">Apliqué técnicas básicas de aseguramiento de calidad y pruebas; debo profundizar en automatización de </w:t>
+            </w:r>
+            <w:proofErr w:type="spellStart"/>
+            <w:r>
+              <w:rPr>
+                <w:sz w:val="18"/>
+              </w:rPr>
+              <w:t>testing</w:t>
+            </w:r>
+            <w:proofErr w:type="spellEnd"/>
+            <w:r>
+              <w:rPr>
+                <w:sz w:val="18"/>
+              </w:rPr>
+              <w:t>.</w:t>
+            </w:r>
           </w:p>
         </w:tc>
       </w:tr>
@@ -1748,7 +1895,8 @@
         </w:trPr>
         <w:tc>
           <w:tcPr>
-            <w:tcW w:w="1931" w:type="dxa"/>
+            <w:tcW w:w="2689" w:type="dxa"/>
+            <w:vAlign w:val="center"/>
           </w:tcPr>
           <w:p>
             <w:pPr>
@@ -1760,11 +1908,17 @@
                 <w:szCs w:val="18"/>
               </w:rPr>
             </w:pPr>
+            <w:r>
+              <w:rPr>
+                <w:sz w:val="20"/>
+              </w:rPr>
+              <w:t>Diseñar arquitecturas de software e integrar plataformas considerando la seguridad en sistemas computacionales.</w:t>
+            </w:r>
           </w:p>
         </w:tc>
         <w:tc>
           <w:tcPr>
-            <w:tcW w:w="1017" w:type="dxa"/>
+            <w:tcW w:w="259" w:type="dxa"/>
           </w:tcPr>
           <w:p>
             <w:pPr>
@@ -1808,6 +1962,15 @@
                 <w:szCs w:val="18"/>
               </w:rPr>
             </w:pPr>
+            <w:r>
+              <w:rPr>
+                <w:b/>
+                <w:bCs/>
+                <w:sz w:val="18"/>
+                <w:szCs w:val="18"/>
+              </w:rPr>
+              <w:t>X</w:t>
+            </w:r>
           </w:p>
         </w:tc>
         <w:tc>
@@ -1845,10 +2008,10 @@
         <w:tc>
           <w:tcPr>
             <w:tcW w:w="2557" w:type="dxa"/>
+            <w:vAlign w:val="center"/>
           </w:tcPr>
           <w:p>
             <w:pPr>
-              <w:jc w:val="center"/>
               <w:rPr>
                 <w:b/>
                 <w:bCs/>
@@ -1856,6 +2019,12 @@
                 <w:szCs w:val="18"/>
               </w:rPr>
             </w:pPr>
+            <w:r>
+              <w:rPr>
+                <w:sz w:val="18"/>
+              </w:rPr>
+              <w:t>Comprendí los principios de arquitectura e integración de plataformas; la seguridad computacional es un área por reforzar.</w:t>
+            </w:r>
           </w:p>
         </w:tc>
       </w:tr>
@@ -1866,7 +2035,8 @@
         </w:trPr>
         <w:tc>
           <w:tcPr>
-            <w:tcW w:w="1931" w:type="dxa"/>
+            <w:tcW w:w="2689" w:type="dxa"/>
+            <w:vAlign w:val="center"/>
           </w:tcPr>
           <w:p>
             <w:pPr>
@@ -1878,11 +2048,17 @@
                 <w:szCs w:val="18"/>
               </w:rPr>
             </w:pPr>
+            <w:r>
+              <w:rPr>
+                <w:sz w:val="20"/>
+              </w:rPr>
+              <w:t>Gestionar proyectos informáticos, evaluando proyectos y gestionando los riesgos asociados.</w:t>
+            </w:r>
           </w:p>
         </w:tc>
         <w:tc>
           <w:tcPr>
-            <w:tcW w:w="1017" w:type="dxa"/>
+            <w:tcW w:w="259" w:type="dxa"/>
           </w:tcPr>
           <w:p>
             <w:pPr>
@@ -1926,6 +2102,15 @@
                 <w:szCs w:val="18"/>
               </w:rPr>
             </w:pPr>
+            <w:r>
+              <w:rPr>
+                <w:b/>
+                <w:bCs/>
+                <w:sz w:val="18"/>
+                <w:szCs w:val="18"/>
+              </w:rPr>
+              <w:t>X</w:t>
+            </w:r>
           </w:p>
         </w:tc>
         <w:tc>
@@ -1963,10 +2148,10 @@
         <w:tc>
           <w:tcPr>
             <w:tcW w:w="2557" w:type="dxa"/>
+            <w:vAlign w:val="center"/>
           </w:tcPr>
           <w:p>
             <w:pPr>
-              <w:jc w:val="center"/>
               <w:rPr>
                 <w:b/>
                 <w:bCs/>
@@ -1974,6 +2159,12 @@
                 <w:szCs w:val="18"/>
               </w:rPr>
             </w:pPr>
+            <w:r>
+              <w:rPr>
+                <w:sz w:val="18"/>
+              </w:rPr>
+              <w:t>Apliqué metodologías de gestión y evaluación de proyectos en trabajos prácticos; me falta experiencia en gestión de riesgos reales.</w:t>
+            </w:r>
           </w:p>
         </w:tc>
       </w:tr>
@@ -1984,7 +2175,8 @@
         </w:trPr>
         <w:tc>
           <w:tcPr>
-            <w:tcW w:w="1931" w:type="dxa"/>
+            <w:tcW w:w="2689" w:type="dxa"/>
+            <w:vAlign w:val="center"/>
           </w:tcPr>
           <w:p>
             <w:pPr>
@@ -1996,11 +2188,32 @@
                 <w:szCs w:val="18"/>
               </w:rPr>
             </w:pPr>
+            <w:r>
+              <w:rPr>
+                <w:sz w:val="20"/>
+              </w:rPr>
+              <w:lastRenderedPageBreak/>
+              <w:t xml:space="preserve">Aplicar inteligencia de negocios mediante BPM, minería de datos y </w:t>
+            </w:r>
+            <w:proofErr w:type="spellStart"/>
+            <w:r>
+              <w:rPr>
+                <w:sz w:val="20"/>
+              </w:rPr>
+              <w:t>big</w:t>
+            </w:r>
+            <w:proofErr w:type="spellEnd"/>
+            <w:r>
+              <w:rPr>
+                <w:sz w:val="20"/>
+              </w:rPr>
+              <w:t xml:space="preserve"> data para apoyar la toma de decisiones.</w:t>
+            </w:r>
           </w:p>
         </w:tc>
         <w:tc>
           <w:tcPr>
-            <w:tcW w:w="1017" w:type="dxa"/>
+            <w:tcW w:w="259" w:type="dxa"/>
           </w:tcPr>
           <w:p>
             <w:pPr>
@@ -2044,6 +2257,15 @@
                 <w:szCs w:val="18"/>
               </w:rPr>
             </w:pPr>
+            <w:r>
+              <w:rPr>
+                <w:b/>
+                <w:bCs/>
+                <w:sz w:val="18"/>
+                <w:szCs w:val="18"/>
+              </w:rPr>
+              <w:t>X</w:t>
+            </w:r>
           </w:p>
         </w:tc>
         <w:tc>
@@ -2081,10 +2303,10 @@
         <w:tc>
           <w:tcPr>
             <w:tcW w:w="2557" w:type="dxa"/>
+            <w:vAlign w:val="center"/>
           </w:tcPr>
           <w:p>
             <w:pPr>
-              <w:jc w:val="center"/>
               <w:rPr>
                 <w:b/>
                 <w:bCs/>
@@ -2092,6 +2314,26 @@
                 <w:szCs w:val="18"/>
               </w:rPr>
             </w:pPr>
+            <w:r>
+              <w:rPr>
+                <w:sz w:val="18"/>
+              </w:rPr>
+              <w:t xml:space="preserve">Utilicé herramientas de inteligencia de negocios y minería de datos a nivel introductorio; </w:t>
+            </w:r>
+            <w:proofErr w:type="spellStart"/>
+            <w:r>
+              <w:rPr>
+                <w:sz w:val="18"/>
+              </w:rPr>
+              <w:t>big</w:t>
+            </w:r>
+            <w:proofErr w:type="spellEnd"/>
+            <w:r>
+              <w:rPr>
+                <w:sz w:val="18"/>
+              </w:rPr>
+              <w:t xml:space="preserve"> data requiere mayor práctica.</w:t>
+            </w:r>
           </w:p>
         </w:tc>
       </w:tr>
@@ -2102,7 +2344,8 @@
         </w:trPr>
         <w:tc>
           <w:tcPr>
-            <w:tcW w:w="1931" w:type="dxa"/>
+            <w:tcW w:w="2689" w:type="dxa"/>
+            <w:vAlign w:val="center"/>
           </w:tcPr>
           <w:p>
             <w:pPr>
@@ -2114,11 +2357,17 @@
                 <w:szCs w:val="18"/>
               </w:rPr>
             </w:pPr>
+            <w:r>
+              <w:rPr>
+                <w:sz w:val="20"/>
+              </w:rPr>
+              <w:t>Comunicarse efectivamente en contextos personales y profesionales, actuando con mentalidad emprendedora y ética profesional.</w:t>
+            </w:r>
           </w:p>
         </w:tc>
         <w:tc>
           <w:tcPr>
-            <w:tcW w:w="1017" w:type="dxa"/>
+            <w:tcW w:w="259" w:type="dxa"/>
           </w:tcPr>
           <w:p>
             <w:pPr>
@@ -2162,6 +2411,15 @@
                 <w:szCs w:val="18"/>
               </w:rPr>
             </w:pPr>
+            <w:r>
+              <w:rPr>
+                <w:b/>
+                <w:bCs/>
+                <w:sz w:val="18"/>
+                <w:szCs w:val="18"/>
+              </w:rPr>
+              <w:t>X</w:t>
+            </w:r>
           </w:p>
         </w:tc>
         <w:tc>
@@ -2199,10 +2457,10 @@
         <w:tc>
           <w:tcPr>
             <w:tcW w:w="2557" w:type="dxa"/>
+            <w:vAlign w:val="center"/>
           </w:tcPr>
           <w:p>
             <w:pPr>
-              <w:jc w:val="center"/>
               <w:rPr>
                 <w:b/>
                 <w:bCs/>
@@ -2210,6 +2468,12 @@
                 <w:szCs w:val="18"/>
               </w:rPr>
             </w:pPr>
+            <w:r>
+              <w:rPr>
+                <w:sz w:val="18"/>
+              </w:rPr>
+              <w:t>Desarrollé habilidades de comunicación efectiva y trabajo ético en equipo; debo seguir fortaleciendo mi inglés profesional.</w:t>
+            </w:r>
           </w:p>
         </w:tc>
       </w:tr>
@@ -9653,12 +9917,6 @@
 </file>
 
 <file path=customXml/item1.xml><?xml version="1.0" encoding="utf-8"?>
-<p:properties xmlns:p="http://schemas.microsoft.com/office/2006/metadata/properties" xmlns:xsi="http://www.w3.org/2001/XMLSchema-instance" xmlns:pc="http://schemas.microsoft.com/office/infopath/2007/PartnerControls">
-  <documentManagement/>
-</p:properties>
-</file>
-
-<file path=customXml/item2.xml><?xml version="1.0" encoding="utf-8"?>
 <?mso-contentType ?>
 <FormTemplates xmlns="http://schemas.microsoft.com/sharepoint/v3/contenttype/forms">
   <Display>DocumentLibraryForm</Display>
@@ -9667,11 +9925,13 @@
 </FormTemplates>
 </file>
 
-<file path=customXml/item3.xml><?xml version="1.0" encoding="utf-8"?>
-<b:Sources xmlns:b="http://schemas.openxmlformats.org/officeDocument/2006/bibliography" xmlns="http://schemas.openxmlformats.org/officeDocument/2006/bibliography" SelectedStyle="\APASixthEditionOfficeOnline.xsl" StyleName="APA" Version="6"/>
+<file path=customXml/item2.xml><?xml version="1.0" encoding="utf-8"?>
+<p:properties xmlns:p="http://schemas.microsoft.com/office/2006/metadata/properties" xmlns:xsi="http://www.w3.org/2001/XMLSchema-instance" xmlns:pc="http://schemas.microsoft.com/office/infopath/2007/PartnerControls">
+  <documentManagement/>
+</p:properties>
 </file>
 
-<file path=customXml/item4.xml><?xml version="1.0" encoding="utf-8"?>
+<file path=customXml/item3.xml><?xml version="1.0" encoding="utf-8"?>
 <ct:contentTypeSchema xmlns:ct="http://schemas.microsoft.com/office/2006/metadata/contentType" xmlns:ma="http://schemas.microsoft.com/office/2006/metadata/properties/metaAttributes" ct:_="" ma:_="" ma:contentTypeName="Documento" ma:contentTypeID="0x010100E96778489EE7714D8BD12CC105EB918B" ma:contentTypeVersion="2" ma:contentTypeDescription="Crear nuevo documento." ma:contentTypeScope="" ma:versionID="416c5c7ae9b5d54d83875cd3c65194e3">
   <xsd:schema xmlns:xsd="http://www.w3.org/2001/XMLSchema" xmlns:xs="http://www.w3.org/2001/XMLSchema" xmlns:p="http://schemas.microsoft.com/office/2006/metadata/properties" xmlns:ns2="126e8a1c-9ea9-435a-ac89-d06c80d62e30" targetNamespace="http://schemas.microsoft.com/office/2006/metadata/properties" ma:root="true" ma:fieldsID="70a237c842677bd850644f8595079f5e" ns2:_="">
     <xsd:import namespace="126e8a1c-9ea9-435a-ac89-d06c80d62e30"/>
@@ -9803,7 +10063,19 @@
 </ct:contentTypeSchema>
 </file>
 
+<file path=customXml/item4.xml><?xml version="1.0" encoding="utf-8"?>
+<b:Sources xmlns:b="http://schemas.openxmlformats.org/officeDocument/2006/bibliography" xmlns="http://schemas.openxmlformats.org/officeDocument/2006/bibliography" SelectedStyle="\APASixthEditionOfficeOnline.xsl" StyleName="APA" Version="6"/>
+</file>
+
 <file path=customXml/itemProps1.xml><?xml version="1.0" encoding="utf-8"?>
+<ds:datastoreItem xmlns:ds="http://schemas.openxmlformats.org/officeDocument/2006/customXml" ds:itemID="{DABAA964-10BA-4DBC-ABF2-CDEAC0FAF7AA}">
+  <ds:schemaRefs>
+    <ds:schemaRef ds:uri="http://schemas.microsoft.com/sharepoint/v3/contenttype/forms"/>
+  </ds:schemaRefs>
+</ds:datastoreItem>
+</file>
+
+<file path=customXml/itemProps2.xml><?xml version="1.0" encoding="utf-8"?>
 <ds:datastoreItem xmlns:ds="http://schemas.openxmlformats.org/officeDocument/2006/customXml" ds:itemID="{5F1783E3-BA1C-4CA3-8E32-C9B378BBED03}">
   <ds:schemaRefs>
     <ds:schemaRef ds:uri="http://schemas.microsoft.com/office/2006/metadata/properties"/>
@@ -9814,23 +10086,7 @@
 </ds:datastoreItem>
 </file>
 
-<file path=customXml/itemProps2.xml><?xml version="1.0" encoding="utf-8"?>
-<ds:datastoreItem xmlns:ds="http://schemas.openxmlformats.org/officeDocument/2006/customXml" ds:itemID="{DABAA964-10BA-4DBC-ABF2-CDEAC0FAF7AA}">
-  <ds:schemaRefs>
-    <ds:schemaRef ds:uri="http://schemas.microsoft.com/sharepoint/v3/contenttype/forms"/>
-  </ds:schemaRefs>
-</ds:datastoreItem>
-</file>
-
 <file path=customXml/itemProps3.xml><?xml version="1.0" encoding="utf-8"?>
-<ds:datastoreItem xmlns:ds="http://schemas.openxmlformats.org/officeDocument/2006/customXml" ds:itemID="{6E8A10B9-B765-4F0B-A47F-7CB788CD8F65}">
-  <ds:schemaRefs>
-    <ds:schemaRef ds:uri="http://schemas.openxmlformats.org/officeDocument/2006/bibliography"/>
-  </ds:schemaRefs>
-</ds:datastoreItem>
-</file>
-
-<file path=customXml/itemProps4.xml><?xml version="1.0" encoding="utf-8"?>
 <ds:datastoreItem xmlns:ds="http://schemas.openxmlformats.org/officeDocument/2006/customXml" ds:itemID="{767CD2D5-7A6C-47C3-9B54-C4225C74DD0B}">
   <ds:schemaRefs>
     <ds:schemaRef ds:uri="http://schemas.microsoft.com/office/2006/metadata/contentType"/>
@@ -9846,4 +10102,12 @@
     <ds:schemaRef ds:uri="http://schemas.microsoft.com/internal/obd"/>
   </ds:schemaRefs>
 </ds:datastoreItem>
+</file>
+
+<file path=customXml/itemProps4.xml><?xml version="1.0" encoding="utf-8"?>
+<ds:datastoreItem xmlns:ds="http://schemas.openxmlformats.org/officeDocument/2006/customXml" ds:itemID="{6E8A10B9-B765-4F0B-A47F-7CB788CD8F65}">
+  <ds:schemaRefs>
+    <ds:schemaRef ds:uri="http://schemas.openxmlformats.org/officeDocument/2006/bibliography"/>
+  </ds:schemaRefs>
+</ds:datastoreItem>
 </file>
</xml_diff>